<commit_message>
2nd version (updated EDA outlier handling)
</commit_message>
<xml_diff>
--- a/Wrangling Strategy (second half).docx
+++ b/Wrangling Strategy (second half).docx
@@ -33,7 +33,21 @@
         <w:rPr>
           <w:rFonts w:ascii="Cambria" w:hAnsi="Cambria"/>
         </w:rPr>
-        <w:t>We will implement basic dataset validation checks to confirm that the final dataset is analysis-ready. This includes verifying the presence of all columns required for analysis (outcome, demographics, selected laboratory predictors, and key identifiers) and confirming that each column has the expected data type (e.g., numeric, categorical/character where applicable). We will also conduct lightweight consistency checks, such as ensuring no duplicated encounter keys, screening for implausible values (e.g., negative age or BMI)</w:t>
+        <w:t xml:space="preserve">We will implement basic dataset validation checks to confirm that the final dataset is </w:t>
+      </w:r>
+      <w:proofErr w:type="gramStart"/>
+      <w:r>
+        <w:rPr>
+          <w:rFonts w:ascii="Cambria" w:hAnsi="Cambria"/>
+        </w:rPr>
+        <w:t>analysis-ready</w:t>
+      </w:r>
+      <w:proofErr w:type="gramEnd"/>
+      <w:r>
+        <w:rPr>
+          <w:rFonts w:ascii="Cambria" w:hAnsi="Cambria"/>
+        </w:rPr>
+        <w:t>. This includes verifying the presence of all columns required for analysis (outcome, demographics, selected laboratory predictors, and key identifiers) and confirming that each column has the expected data type (e.g., numeric, categorical/character where applicable). We will also conduct lightweight consistency checks, such as ensuring no duplicated encounter keys, screening for implausible values (e.g., negative age or BMI)</w:t>
       </w:r>
       <w:r>
         <w:rPr>
@@ -133,7 +147,21 @@
         <w:rPr>
           <w:rFonts w:ascii="Cambria" w:hAnsi="Cambria"/>
         </w:rPr>
-        <w:t>After validating the final dataset, we will construct the modeling cohort by retaining all encounters labeled as hypoxemia and randomly sampling an equal number of non-hypoxemia encounters to form a balanced dataset for analysis. We will then split this cohort into training (70%) and test (30%) sets. The training set will be used for exploratory analyses</w:t>
+        <w:t>After validating the final dataset, we will construct the modeling cohort by retaining all encounters labeled as hypoxemia and randomly sampling an equal number of non-</w:t>
+      </w:r>
+      <w:proofErr w:type="gramStart"/>
+      <w:r>
+        <w:rPr>
+          <w:rFonts w:ascii="Cambria" w:hAnsi="Cambria"/>
+        </w:rPr>
+        <w:t>hypoxemia</w:t>
+      </w:r>
+      <w:proofErr w:type="gramEnd"/>
+      <w:r>
+        <w:rPr>
+          <w:rFonts w:ascii="Cambria" w:hAnsi="Cambria"/>
+        </w:rPr>
+        <w:t xml:space="preserve"> encounters to form a balanced dataset for analysis. We will then split this cohort into training (70%) and test (30%) sets. The training set will be used for exploratory analyses</w:t>
       </w:r>
       <w:r>
         <w:rPr>
@@ -305,6 +333,18 @@
         </w:rPr>
         <w:t>potential outliers.</w:t>
       </w:r>
+      <w:r>
+        <w:rPr>
+          <w:rFonts w:ascii="Cambria" w:hAnsi="Cambria"/>
+        </w:rPr>
+        <w:t xml:space="preserve"> </w:t>
+      </w:r>
+      <w:r>
+        <w:rPr>
+          <w:rFonts w:ascii="Cambria" w:hAnsi="Cambria"/>
+        </w:rPr>
+        <w:t>If potential outliers are identified, we will assess whether they are likely data errors (e.g., unit or entry issues) or clinically plausible extreme values. Implausible values will be set to missing and handled according to our missing-data strategy, whereas plausible extreme values will be retained and addressed using appropriate transformations (e.g., log-transform for skewed variables) or winsorization (e.g., capping at percentile-based thresholds determined from the training set).</w:t>
+      </w:r>
     </w:p>
     <w:p>
       <w:pPr>
@@ -369,7 +409,21 @@
         <w:rPr>
           <w:rFonts w:ascii="Cambria" w:hAnsi="Cambria"/>
         </w:rPr>
-        <w:t xml:space="preserve">with postoperative hypoxemia as the binary outcome and the full set of candidate predictors (demographics and selected laboratory predictors) as independent variables, and identify </w:t>
+        <w:t xml:space="preserve">with postoperative hypoxemia as the binary outcome and the full set of candidate predictors (demographics and selected laboratory predictors) as independent </w:t>
+      </w:r>
+      <w:proofErr w:type="gramStart"/>
+      <w:r>
+        <w:rPr>
+          <w:rFonts w:ascii="Cambria" w:hAnsi="Cambria"/>
+        </w:rPr>
+        <w:t>variables, and</w:t>
+      </w:r>
+      <w:proofErr w:type="gramEnd"/>
+      <w:r>
+        <w:rPr>
+          <w:rFonts w:ascii="Cambria" w:hAnsi="Cambria"/>
+        </w:rPr>
+        <w:t xml:space="preserve"> identify </w:t>
       </w:r>
       <w:r>
         <w:rPr>
@@ -440,7 +494,21 @@
         <w:rPr>
           <w:rFonts w:ascii="Cambria" w:hAnsi="Cambria"/>
         </w:rPr>
-        <w:t xml:space="preserve"> using only the significant predictors identified in Research Question 1, and evaluate predictive performance on the test set.</w:t>
+        <w:t xml:space="preserve"> using only the significant predictors identified in Research Question </w:t>
+      </w:r>
+      <w:proofErr w:type="gramStart"/>
+      <w:r>
+        <w:rPr>
+          <w:rFonts w:ascii="Cambria" w:hAnsi="Cambria"/>
+        </w:rPr>
+        <w:t>1, and</w:t>
+      </w:r>
+      <w:proofErr w:type="gramEnd"/>
+      <w:r>
+        <w:rPr>
+          <w:rFonts w:ascii="Cambria" w:hAnsi="Cambria"/>
+        </w:rPr>
+        <w:t xml:space="preserve"> evaluate predictive performance on the test set.</w:t>
       </w:r>
       <w:r>
         <w:rPr>
@@ -553,7 +621,14 @@
         <w:rPr>
           <w:rFonts w:ascii="Cambria" w:hAnsi="Cambria"/>
         </w:rPr>
-        <w:t xml:space="preserve"> including a .csv file containing the estimated coefficients and Wald test p-values from the Research Question 1 (full) model, and a .txt file reporting the test-set misclassification error rate for the Research Question 2 (reduced) model.</w:t>
+        <w:t xml:space="preserve"> including a .csv file containing the estimated coefficients and Wald test p-values from </w:t>
+      </w:r>
+      <w:r>
+        <w:rPr>
+          <w:rFonts w:ascii="Cambria" w:hAnsi="Cambria"/>
+        </w:rPr>
+        <w:lastRenderedPageBreak/>
+        <w:t>the Research Question 1 (full) model, and a .txt file reporting the test-set misclassification error rate for the Research Question 2 (reduced) model.</w:t>
       </w:r>
     </w:p>
     <w:sectPr>

</xml_diff>